<commit_message>
Link directly to companion source files in CAE guides
Co-authored-by: Codex <noreply@openai.com>
AI-Model: codex=gpt-6-astra
</commit_message>
<xml_diff>
--- a/guides/cae-pd-handout.docx
+++ b/guides/cae-pd-handout.docx
@@ -301,54 +301,29 @@
         <w:pStyle w:val="Heading1"/>
       </w:pPr>
       <w:r>
-        <w:t>Get the companion exercise onto CAE</w:t>
+        <w:t>Companion code</w:t>
       </w:r>
     </w:p>
     <w:p>
       <w:pPr/>
       <w:r>
-        <w:t>On your laptop, open Terminal or PowerShell. Clone the guide repository, then copy it to your CAE home directory:</w:t>
-      </w:r>
-    </w:p>
-    <w:p>
-      <w:pPr>
-        <w:pStyle w:val="Code"/>
-        <w:keepLines/>
-        <w:spacing w:after="160"/>
-      </w:pPr>
-      <w:r>
-        <w:t xml:space="preserve">git clone </w:t>
+        <w:t xml:space="preserve">Synthesis runner: </w:t>
       </w:r>
       <w:hyperlink r:id="rId15">
         <w:r>
           <w:rPr>
             <w:color w:val="0563C1"/>
             <w:u w:val="single"/>
-            <w:rFonts w:ascii="Courier New" w:hAnsi="Courier New"/>
-            <w:sz w:val="18"/>
           </w:rPr>
-          <w:t>https://github.com/abhinavnandwani/cae-synopsys-guides.git</w:t>
+          <w:t>https://github.com/abhinavnandwani/cae-synopsys-guides/blob/main/lab/run_lab.py</w:t>
         </w:r>
       </w:hyperlink>
-      <w:r>
-        <w:br/>
-        <w:t>scp -r cae-synopsys-guides YOUR_NETID@best-tux.cae.wisc.edu:~/</w:t>
-      </w:r>
+      <w:r/>
     </w:p>
     <w:p>
       <w:pPr/>
       <w:r>
-        <w:t xml:space="preserve">Replace </w:t>
-      </w:r>
-      <w:r>
-        <w:rPr>
-          <w:rFonts w:ascii="Courier New" w:hAnsi="Courier New"/>
-          <w:sz w:val="18"/>
-        </w:rPr>
-        <w:t>YOUR_NETID</w:t>
-      </w:r>
-      <w:r>
-        <w:t xml:space="preserve"> with your NetID. Check a new SSH host key against the CAE fingerprint at </w:t>
+        <w:t xml:space="preserve">Synthesis script: </w:t>
       </w:r>
       <w:hyperlink r:id="rId16">
         <w:r>
@@ -356,97 +331,57 @@
             <w:color w:val="0563C1"/>
             <w:u w:val="single"/>
           </w:rPr>
-          <w:t>https://kb.wisc.edu/moodle/162780</w:t>
+          <w:t>https://github.com/abhinavnandwani/cae-synopsys-guides/blob/main/lab/synth/run.tcl</w:t>
         </w:r>
       </w:hyperlink>
+      <w:r/>
+    </w:p>
+    <w:p>
+      <w:pPr/>
       <w:r>
-        <w:t xml:space="preserve"> before accepting. If Git is unavailable, extract the repository ZIP, rename its folder to </w:t>
+        <w:t xml:space="preserve">Reference library script: </w:t>
+      </w:r>
+      <w:hyperlink r:id="rId17">
+        <w:r>
+          <w:rPr>
+            <w:color w:val="0563C1"/>
+            <w:u w:val="single"/>
+          </w:rPr>
+          <w:t>https://github.com/abhinavnandwani/cae-synopsys-guides/blob/main/lab/physical/build_reference.tcl</w:t>
+        </w:r>
+      </w:hyperlink>
+      <w:r/>
+    </w:p>
+    <w:p>
+      <w:pPr/>
+      <w:r>
+        <w:t xml:space="preserve">Floorplan script: </w:t>
+      </w:r>
+      <w:hyperlink r:id="rId18">
+        <w:r>
+          <w:rPr>
+            <w:color w:val="0563C1"/>
+            <w:u w:val="single"/>
+          </w:rPr>
+          <w:t>https://github.com/abhinavnandwani/cae-synopsys-guides/blob/main/lab/physical/floorplan.tcl</w:t>
+        </w:r>
+      </w:hyperlink>
+      <w:r/>
+    </w:p>
+    <w:p>
+      <w:pPr/>
+      <w:r>
+        <w:t xml:space="preserve">Commands below use </w:t>
       </w:r>
       <w:r>
         <w:rPr>
           <w:rFonts w:ascii="Courier New" w:hAnsi="Courier New"/>
           <w:sz w:val="18"/>
         </w:rPr>
-        <w:t>cae-synopsys-guides</w:t>
+        <w:t>~/cae-synopsys-guides/lab</w:t>
       </w:r>
       <w:r>
-        <w:t>, then run the SCP line. Guacamole does not provide file transfer. The repository README also explains cloning directly on CAE.</w:t>
-      </w:r>
-    </w:p>
-    <w:p>
-      <w:pPr/>
-      <w:r>
-        <w:t>Back in the CAE container terminal:</w:t>
-      </w:r>
-    </w:p>
-    <w:p>
-      <w:pPr>
-        <w:pStyle w:val="Code"/>
-        <w:keepLines/>
-        <w:spacing w:after="160"/>
-      </w:pPr>
-      <w:r>
-        <w:t>cd ~/cae-synopsys-guides/lab</w:t>
-        <w:br/>
-        <w:t>pwd</w:t>
-        <w:br/>
-        <w:t>ls</w:t>
-      </w:r>
-    </w:p>
-    <w:p>
-      <w:pPr/>
-      <w:r>
-        <w:t xml:space="preserve">You should see </w:t>
-      </w:r>
-      <w:r>
-        <w:rPr>
-          <w:rFonts w:ascii="Courier New" w:hAnsi="Courier New"/>
-          <w:sz w:val="18"/>
-        </w:rPr>
-        <w:t>run_lab.py</w:t>
-      </w:r>
-      <w:r>
-        <w:t xml:space="preserve">, </w:t>
-      </w:r>
-      <w:r>
-        <w:rPr>
-          <w:rFonts w:ascii="Courier New" w:hAnsi="Courier New"/>
-          <w:sz w:val="18"/>
-        </w:rPr>
-        <w:t>rtl</w:t>
-      </w:r>
-      <w:r>
-        <w:t xml:space="preserve">, </w:t>
-      </w:r>
-      <w:r>
-        <w:rPr>
-          <w:rFonts w:ascii="Courier New" w:hAnsi="Courier New"/>
-          <w:sz w:val="18"/>
-        </w:rPr>
-        <w:t>tb</w:t>
-      </w:r>
-      <w:r>
-        <w:t xml:space="preserve">, </w:t>
-      </w:r>
-      <w:r>
-        <w:rPr>
-          <w:rFonts w:ascii="Courier New" w:hAnsi="Courier New"/>
-          <w:sz w:val="18"/>
-        </w:rPr>
-        <w:t>synth</w:t>
-      </w:r>
-      <w:r>
-        <w:t xml:space="preserve">, and </w:t>
-      </w:r>
-      <w:r>
-        <w:rPr>
-          <w:rFonts w:ascii="Courier New" w:hAnsi="Courier New"/>
-          <w:sz w:val="18"/>
-        </w:rPr>
-        <w:t>README.md</w:t>
-      </w:r>
-      <w:r>
-        <w:t>. The recorded screenshots use a dated demonstration folder. Use the folder you copied. Keep work in your home directory so it is available across CAE hosts.</w:t>
+        <w:t xml:space="preserve"> as the exercise directory. The recorded screenshots show the original dated demonstration folder.</w:t>
       </w:r>
     </w:p>
     <w:p>
@@ -676,22 +611,7 @@
                 <w:b w:val="0"/>
                 <w:sz w:val="18"/>
               </w:rPr>
-              <w:t xml:space="preserve"> and </w:t>
-            </w:r>
-            <w:r>
-              <w:rPr>
-                <w:rFonts w:ascii="Courier New" w:hAnsi="Courier New"/>
-                <w:b w:val="0"/>
-                <w:sz w:val="18"/>
-              </w:rPr>
-              <w:t>scp</w:t>
-            </w:r>
-            <w:r>
-              <w:rPr>
-                <w:b w:val="0"/>
-                <w:sz w:val="18"/>
-              </w:rPr>
-              <w:t xml:space="preserve"> to reach CAE or transfer files.</w:t>
+              <w:t xml:space="preserve"> to reach the CAE host shell.</w:t>
             </w:r>
           </w:p>
         </w:tc>
@@ -2261,7 +2181,7 @@
                     <pic:cNvPicPr/>
                   </pic:nvPicPr>
                   <pic:blipFill>
-                    <a:blip r:embed="rId17"/>
+                    <a:blip r:embed="rId19"/>
                     <a:srcRect l="1778" t="11980" r="81" b="26230"/>
                     <a:stretch>
                       <a:fillRect/>
@@ -2380,7 +2300,7 @@
                     <pic:cNvPicPr/>
                   </pic:nvPicPr>
                   <pic:blipFill>
-                    <a:blip r:embed="rId18"/>
+                    <a:blip r:embed="rId20"/>
                     <a:srcRect l="27324" t="14628" r="28698" b="22825"/>
                     <a:stretch>
                       <a:fillRect/>
@@ -3311,7 +3231,7 @@
                     <pic:cNvPicPr/>
                   </pic:nvPicPr>
                   <pic:blipFill>
-                    <a:blip r:embed="rId19"/>
+                    <a:blip r:embed="rId21"/>
                     <a:srcRect l="0" t="6557" r="0" b="6305"/>
                     <a:stretch>
                       <a:fillRect/>
@@ -4099,7 +4019,7 @@
       <w:r>
         <w:t xml:space="preserve">Setup: </w:t>
       </w:r>
-      <w:hyperlink r:id="rId20">
+      <w:hyperlink r:id="rId22">
         <w:r>
           <w:rPr>
             <w:color w:val="0563C1"/>
@@ -4115,7 +4035,7 @@
       <w:r>
         <w:t xml:space="preserve">ICC2 capabilities: </w:t>
       </w:r>
-      <w:hyperlink r:id="rId21">
+      <w:hyperlink r:id="rId23">
         <w:r>
           <w:rPr>
             <w:color w:val="0563C1"/>

</xml_diff>

<commit_message>
Keep CAE guides focused on standalone tool walkthroughs
Co-authored-by: Codex <noreply@openai.com>

AI-Model: codex=gpt-6-astra
</commit_message>
<xml_diff>
--- a/guides/cae-pd-handout.docx
+++ b/guides/cae-pd-handout.docx
@@ -23,7 +23,7 @@
     <w:p>
       <w:pPr/>
       <w:r>
-        <w:t>Use this guide to run synthesis, inspect mapped logic and timing in Design Vision, and bring a small design into IC Compiler II for physical inspection. Keep the terminal transcript, scripts, and GUI observations together. The register example teaches the workflow; its area and timing are not accelerator estimates.</w:t>
+        <w:t>Use this guide to run synthesis, inspect mapped logic and timing in Design Vision, and bring a small design into IC Compiler II for physical inspection. Keep the terminal transcript, scripts, and GUI observations together. The measurements in this guide describe only the one-register example.</w:t>
       </w:r>
     </w:p>
     <w:p>
@@ -160,7 +160,7 @@
     <w:p>
       <w:pPr/>
       <w:r>
-        <w:t xml:space="preserve">Official CAE login instructions and screenshots: </w:t>
+        <w:t xml:space="preserve">More help with Guacamole sign-in, including CAE's official instructions and screenshots: </w:t>
       </w:r>
       <w:hyperlink r:id="rId13">
         <w:r>
@@ -1961,7 +1961,7 @@
     <w:p>
       <w:pPr/>
       <w:r>
-        <w:t>The period is 10 ns. The input delay reserves time for the external launch side; the output delay reserves time for the external capture side. These values are assumptions for learning the tools, not a project timing budget. Real constraints must also address applicable generated clocks, input transition, output load, uncertainty, exceptions, and operating scenarios.</w:t>
+        <w:t>The period is 10 ns. The input delay reserves time for the external launch side; the output delay reserves time for the external capture side. These values are assumptions for this example. Constraints for other designs may also need generated clocks, input transition, output load, uncertainty, exceptions, and operating scenarios.</w:t>
       </w:r>
     </w:p>
     <w:p>
@@ -2911,7 +2911,7 @@
     <w:p>
       <w:pPr/>
       <w:r>
-        <w:t>The teaching corner is RVT, TT, 1.05 V, 25 C. It is not a project process or signoff-corner decision. Agree the project library, corners, RC setup, and constraints before reporting meaningful PPA.</w:t>
+        <w:t>The teaching corner is RVT, TT, 1.05 V, 25 C. Area and timing results depend on the library, corner, parasitic assumptions, and constraints used for the run.</w:t>
       </w:r>
     </w:p>
     <w:p>
@@ -3131,13 +3131,13 @@
     <w:p>
       <w:pPr/>
       <w:r>
-        <w:t>The boundary and offset are teaching dimensions in the technology's distance units. The tool snaps the core to the site rows. This tiny design deliberately leaves plenty of empty space. It does not establish the accelerator's utilization target or floorplan dimensions.</w:t>
+        <w:t>The boundary and offset are teaching dimensions in the technology's distance units. The tool snaps the core to the site rows. This tiny design deliberately leaves plenty of empty space.</w:t>
       </w:r>
     </w:p>
     <w:p>
       <w:pPr/>
       <w:r>
-        <w:t>Check the successful-link message, floorplan-completion message, cell location/status, and saved files. The tested technology also prompted ICC2 to derive missing preferred routing directions. Review that setup before routing a project design. The completion marker only means the script reached its end; errors earlier in the log still need attention.</w:t>
+        <w:t>Check the successful-link message, floorplan-completion message, cell location/status, and saved files. The tested technology also prompted ICC2 to derive missing preferred routing directions. Review that setup before attempting routing. The completion marker only means the script reached its end; errors earlier in the log still need attention.</w:t>
       </w:r>
     </w:p>
     <w:p>
@@ -3474,498 +3474,13 @@
     <w:p>
       <w:pPr/>
       <w:r>
-        <w:t>The demonstrated physical exercise ends after import, floorplan initialization, and initial placement. It has not built a power grid, assigned a final pin plan, performed detailed legalization, constructed the clock tree, routed signals, extracted final parasitics, or passed signoff checks. Before extending it, establish the approved technology, RC data, scenarios, power setup, and physical checks for the project.</w:t>
+        <w:t>The demonstrated physical exercise ends after import, floorplan initialization, and initial placement. It has not built a power grid, assigned a final pin plan, performed detailed legalization, constructed the clock tree, routed signals, extracted final parasitics, or passed signoff checks.</w:t>
       </w:r>
     </w:p>
     <w:p>
       <w:pPr/>
       <w:r>
         <w:t>Do not hide a warning by suppressing it just to get a cleaner screenshot. Record whether it is a teaching-library limitation, a missing flow input, or a real design problem. Separate those from the measured outcomes of a completed implementation stage.</w:t>
-      </w:r>
-    </w:p>
-    <w:p>
-      <w:r>
-        <w:br w:type="page"/>
-      </w:r>
-    </w:p>
-    <w:p>
-      <w:pPr>
-        <w:pStyle w:val="Heading1"/>
-      </w:pPr>
-      <w:r>
-        <w:t>Build chip-level and per-unit runs</w:t>
-      </w:r>
-    </w:p>
-    <w:p>
-      <w:pPr/>
-      <w:r>
-        <w:t>Keep one explicit configuration for the chip and one for each unit. Each configuration should identify its top module, ordered source manifest, parameters, clocks, interface budgets, library/corner, and implementation status. A stub may make the flow runnable while RTL is unfinished, but its outputs and timing assumptions must be visible in the run record.</w:t>
-      </w:r>
-    </w:p>
-    <w:tbl>
-      <w:tblPr>
-        <w:tblW w:type="auto" w:w="0"/>
-        <w:tblLayout w:type="fixed"/>
-        <w:tblLook w:firstColumn="1" w:firstRow="1" w:lastColumn="0" w:lastRow="0" w:noHBand="0" w:noVBand="1" w:val="04A0"/>
-      </w:tblPr>
-      <w:tblGrid>
-        <w:gridCol w:w="2952"/>
-        <w:gridCol w:w="7128"/>
-      </w:tblGrid>
-      <w:tr>
-        <w:trPr>
-          <w:cantSplit/>
-          <w:tblHeader/>
-        </w:trPr>
-        <w:tc>
-          <w:tcPr>
-            <w:tcW w:type="dxa" w:w="2952"/>
-            <w:tcMar>
-              <w:top w:w="75" w:type="dxa"/>
-              <w:left w:w="75" w:type="dxa"/>
-              <w:bottom w:w="75" w:type="dxa"/>
-              <w:right w:w="75" w:type="dxa"/>
-            </w:tcMar>
-            <w:tcBorders>
-              <w:top w:val="single" w:sz="4" w:color="D5D5D5"/>
-              <w:left w:val="single" w:sz="4" w:color="D5D5D5"/>
-              <w:bottom w:val="single" w:sz="4" w:color="D5D5D5"/>
-              <w:right w:val="single" w:sz="4" w:color="D5D5D5"/>
-            </w:tcBorders>
-            <w:shd w:fill="EEEEEE"/>
-          </w:tcPr>
-          <w:p>
-            <w:pPr>
-              <w:spacing w:after="80" w:before="80"/>
-            </w:pPr>
-            <w:r>
-              <w:rPr>
-                <w:b/>
-                <w:sz w:val="18"/>
-              </w:rPr>
-              <w:t>Evidence to retain for each target</w:t>
-            </w:r>
-          </w:p>
-        </w:tc>
-        <w:tc>
-          <w:tcPr>
-            <w:tcW w:type="dxa" w:w="7128"/>
-            <w:tcMar>
-              <w:top w:w="75" w:type="dxa"/>
-              <w:left w:w="75" w:type="dxa"/>
-              <w:bottom w:w="75" w:type="dxa"/>
-              <w:right w:w="75" w:type="dxa"/>
-            </w:tcMar>
-            <w:tcBorders>
-              <w:top w:val="single" w:sz="4" w:color="D5D5D5"/>
-              <w:left w:val="single" w:sz="4" w:color="D5D5D5"/>
-              <w:bottom w:val="single" w:sz="4" w:color="D5D5D5"/>
-              <w:right w:val="single" w:sz="4" w:color="D5D5D5"/>
-            </w:tcBorders>
-            <w:shd w:fill="EEEEEE"/>
-          </w:tcPr>
-          <w:p>
-            <w:pPr>
-              <w:spacing w:after="80" w:before="80"/>
-            </w:pPr>
-            <w:r>
-              <w:rPr>
-                <w:b/>
-                <w:sz w:val="18"/>
-              </w:rPr>
-              <w:t>Review question</w:t>
-            </w:r>
-          </w:p>
-        </w:tc>
-      </w:tr>
-      <w:tr>
-        <w:trPr>
-          <w:cantSplit/>
-        </w:trPr>
-        <w:tc>
-          <w:tcPr>
-            <w:tcW w:type="dxa" w:w="2952"/>
-            <w:tcMar>
-              <w:top w:w="75" w:type="dxa"/>
-              <w:left w:w="75" w:type="dxa"/>
-              <w:bottom w:w="75" w:type="dxa"/>
-              <w:right w:w="75" w:type="dxa"/>
-            </w:tcMar>
-            <w:tcBorders>
-              <w:top w:val="single" w:sz="4" w:color="D5D5D5"/>
-              <w:left w:val="single" w:sz="4" w:color="D5D5D5"/>
-              <w:bottom w:val="single" w:sz="4" w:color="D5D5D5"/>
-              <w:right w:val="single" w:sz="4" w:color="D5D5D5"/>
-            </w:tcBorders>
-          </w:tcPr>
-          <w:p>
-            <w:pPr>
-              <w:spacing w:after="80" w:before="80"/>
-            </w:pPr>
-            <w:r>
-              <w:rPr>
-                <w:b w:val="0"/>
-                <w:sz w:val="18"/>
-              </w:rPr>
-              <w:t>Input manifest and revision</w:t>
-            </w:r>
-          </w:p>
-        </w:tc>
-        <w:tc>
-          <w:tcPr>
-            <w:tcW w:type="dxa" w:w="7128"/>
-            <w:tcMar>
-              <w:top w:w="75" w:type="dxa"/>
-              <w:left w:w="75" w:type="dxa"/>
-              <w:bottom w:w="75" w:type="dxa"/>
-              <w:right w:w="75" w:type="dxa"/>
-            </w:tcMar>
-            <w:tcBorders>
-              <w:top w:val="single" w:sz="4" w:color="D5D5D5"/>
-              <w:left w:val="single" w:sz="4" w:color="D5D5D5"/>
-              <w:bottom w:val="single" w:sz="4" w:color="D5D5D5"/>
-              <w:right w:val="single" w:sz="4" w:color="D5D5D5"/>
-            </w:tcBorders>
-          </w:tcPr>
-          <w:p>
-            <w:pPr>
-              <w:spacing w:after="80" w:before="80"/>
-            </w:pPr>
-            <w:r>
-              <w:rPr>
-                <w:b w:val="0"/>
-                <w:sz w:val="18"/>
-              </w:rPr>
-              <w:t>Exactly what design and stubs were implemented?</w:t>
-            </w:r>
-          </w:p>
-        </w:tc>
-      </w:tr>
-      <w:tr>
-        <w:trPr>
-          <w:cantSplit/>
-        </w:trPr>
-        <w:tc>
-          <w:tcPr>
-            <w:tcW w:type="dxa" w:w="2952"/>
-            <w:tcMar>
-              <w:top w:w="75" w:type="dxa"/>
-              <w:left w:w="75" w:type="dxa"/>
-              <w:bottom w:w="75" w:type="dxa"/>
-              <w:right w:w="75" w:type="dxa"/>
-            </w:tcMar>
-            <w:tcBorders>
-              <w:top w:val="single" w:sz="4" w:color="D5D5D5"/>
-              <w:left w:val="single" w:sz="4" w:color="D5D5D5"/>
-              <w:bottom w:val="single" w:sz="4" w:color="D5D5D5"/>
-              <w:right w:val="single" w:sz="4" w:color="D5D5D5"/>
-            </w:tcBorders>
-          </w:tcPr>
-          <w:p>
-            <w:pPr>
-              <w:spacing w:after="80" w:before="80"/>
-            </w:pPr>
-            <w:r>
-              <w:rPr>
-                <w:b w:val="0"/>
-                <w:sz w:val="18"/>
-              </w:rPr>
-              <w:t>Library and constraints</w:t>
-            </w:r>
-          </w:p>
-        </w:tc>
-        <w:tc>
-          <w:tcPr>
-            <w:tcW w:type="dxa" w:w="7128"/>
-            <w:tcMar>
-              <w:top w:w="75" w:type="dxa"/>
-              <w:left w:w="75" w:type="dxa"/>
-              <w:bottom w:w="75" w:type="dxa"/>
-              <w:right w:w="75" w:type="dxa"/>
-            </w:tcMar>
-            <w:tcBorders>
-              <w:top w:val="single" w:sz="4" w:color="D5D5D5"/>
-              <w:left w:val="single" w:sz="4" w:color="D5D5D5"/>
-              <w:bottom w:val="single" w:sz="4" w:color="D5D5D5"/>
-              <w:right w:val="single" w:sz="4" w:color="D5D5D5"/>
-            </w:tcBorders>
-          </w:tcPr>
-          <w:p>
-            <w:pPr>
-              <w:spacing w:after="80" w:before="80"/>
-            </w:pPr>
-            <w:r>
-              <w:rPr>
-                <w:b w:val="0"/>
-                <w:sz w:val="18"/>
-              </w:rPr>
-              <w:t>Under what assumptions are the numbers meaningful?</w:t>
-            </w:r>
-          </w:p>
-        </w:tc>
-      </w:tr>
-      <w:tr>
-        <w:trPr>
-          <w:cantSplit/>
-        </w:trPr>
-        <w:tc>
-          <w:tcPr>
-            <w:tcW w:type="dxa" w:w="2952"/>
-            <w:tcMar>
-              <w:top w:w="75" w:type="dxa"/>
-              <w:left w:w="75" w:type="dxa"/>
-              <w:bottom w:w="75" w:type="dxa"/>
-              <w:right w:w="75" w:type="dxa"/>
-            </w:tcMar>
-            <w:tcBorders>
-              <w:top w:val="single" w:sz="4" w:color="D5D5D5"/>
-              <w:left w:val="single" w:sz="4" w:color="D5D5D5"/>
-              <w:bottom w:val="single" w:sz="4" w:color="D5D5D5"/>
-              <w:right w:val="single" w:sz="4" w:color="D5D5D5"/>
-            </w:tcBorders>
-          </w:tcPr>
-          <w:p>
-            <w:pPr>
-              <w:spacing w:after="80" w:before="80"/>
-            </w:pPr>
-            <w:r>
-              <w:rPr>
-                <w:b w:val="0"/>
-                <w:sz w:val="18"/>
-              </w:rPr>
-              <w:t>Logs and design checks</w:t>
-            </w:r>
-          </w:p>
-        </w:tc>
-        <w:tc>
-          <w:tcPr>
-            <w:tcW w:type="dxa" w:w="7128"/>
-            <w:tcMar>
-              <w:top w:w="75" w:type="dxa"/>
-              <w:left w:w="75" w:type="dxa"/>
-              <w:bottom w:w="75" w:type="dxa"/>
-              <w:right w:w="75" w:type="dxa"/>
-            </w:tcMar>
-            <w:tcBorders>
-              <w:top w:val="single" w:sz="4" w:color="D5D5D5"/>
-              <w:left w:val="single" w:sz="4" w:color="D5D5D5"/>
-              <w:bottom w:val="single" w:sz="4" w:color="D5D5D5"/>
-              <w:right w:val="single" w:sz="4" w:color="D5D5D5"/>
-            </w:tcBorders>
-          </w:tcPr>
-          <w:p>
-            <w:pPr>
-              <w:spacing w:after="80" w:before="80"/>
-            </w:pPr>
-            <w:r>
-              <w:rPr>
-                <w:b w:val="0"/>
-                <w:sz w:val="18"/>
-              </w:rPr>
-              <w:t>Did the tool resolve references and complete each stage?</w:t>
-            </w:r>
-          </w:p>
-        </w:tc>
-      </w:tr>
-      <w:tr>
-        <w:trPr>
-          <w:cantSplit/>
-        </w:trPr>
-        <w:tc>
-          <w:tcPr>
-            <w:tcW w:type="dxa" w:w="2952"/>
-            <w:tcMar>
-              <w:top w:w="75" w:type="dxa"/>
-              <w:left w:w="75" w:type="dxa"/>
-              <w:bottom w:w="75" w:type="dxa"/>
-              <w:right w:w="75" w:type="dxa"/>
-            </w:tcMar>
-            <w:tcBorders>
-              <w:top w:val="single" w:sz="4" w:color="D5D5D5"/>
-              <w:left w:val="single" w:sz="4" w:color="D5D5D5"/>
-              <w:bottom w:val="single" w:sz="4" w:color="D5D5D5"/>
-              <w:right w:val="single" w:sz="4" w:color="D5D5D5"/>
-            </w:tcBorders>
-          </w:tcPr>
-          <w:p>
-            <w:pPr>
-              <w:spacing w:after="80" w:before="80"/>
-            </w:pPr>
-            <w:r>
-              <w:rPr>
-                <w:b w:val="0"/>
-                <w:sz w:val="18"/>
-              </w:rPr>
-              <w:t>Mapped netlist and SDC</w:t>
-            </w:r>
-          </w:p>
-        </w:tc>
-        <w:tc>
-          <w:tcPr>
-            <w:tcW w:type="dxa" w:w="7128"/>
-            <w:tcMar>
-              <w:top w:w="75" w:type="dxa"/>
-              <w:left w:w="75" w:type="dxa"/>
-              <w:bottom w:w="75" w:type="dxa"/>
-              <w:right w:w="75" w:type="dxa"/>
-            </w:tcMar>
-            <w:tcBorders>
-              <w:top w:val="single" w:sz="4" w:color="D5D5D5"/>
-              <w:left w:val="single" w:sz="4" w:color="D5D5D5"/>
-              <w:bottom w:val="single" w:sz="4" w:color="D5D5D5"/>
-              <w:right w:val="single" w:sz="4" w:color="D5D5D5"/>
-            </w:tcBorders>
-          </w:tcPr>
-          <w:p>
-            <w:pPr>
-              <w:spacing w:after="80" w:before="80"/>
-            </w:pPr>
-            <w:r>
-              <w:rPr>
-                <w:b w:val="0"/>
-                <w:sz w:val="18"/>
-              </w:rPr>
-              <w:t>Can the next stage consume the result reproducibly?</w:t>
-            </w:r>
-          </w:p>
-        </w:tc>
-      </w:tr>
-      <w:tr>
-        <w:trPr>
-          <w:cantSplit/>
-        </w:trPr>
-        <w:tc>
-          <w:tcPr>
-            <w:tcW w:type="dxa" w:w="2952"/>
-            <w:tcMar>
-              <w:top w:w="75" w:type="dxa"/>
-              <w:left w:w="75" w:type="dxa"/>
-              <w:bottom w:w="75" w:type="dxa"/>
-              <w:right w:w="75" w:type="dxa"/>
-            </w:tcMar>
-            <w:tcBorders>
-              <w:top w:val="single" w:sz="4" w:color="D5D5D5"/>
-              <w:left w:val="single" w:sz="4" w:color="D5D5D5"/>
-              <w:bottom w:val="single" w:sz="4" w:color="D5D5D5"/>
-              <w:right w:val="single" w:sz="4" w:color="D5D5D5"/>
-            </w:tcBorders>
-          </w:tcPr>
-          <w:p>
-            <w:pPr>
-              <w:spacing w:after="80" w:before="80"/>
-            </w:pPr>
-            <w:r>
-              <w:rPr>
-                <w:b w:val="0"/>
-                <w:sz w:val="18"/>
-              </w:rPr>
-              <w:t>Saved physical block and stage</w:t>
-            </w:r>
-          </w:p>
-        </w:tc>
-        <w:tc>
-          <w:tcPr>
-            <w:tcW w:type="dxa" w:w="7128"/>
-            <w:tcMar>
-              <w:top w:w="75" w:type="dxa"/>
-              <w:left w:w="75" w:type="dxa"/>
-              <w:bottom w:w="75" w:type="dxa"/>
-              <w:right w:w="75" w:type="dxa"/>
-            </w:tcMar>
-            <w:tcBorders>
-              <w:top w:val="single" w:sz="4" w:color="D5D5D5"/>
-              <w:left w:val="single" w:sz="4" w:color="D5D5D5"/>
-              <w:bottom w:val="single" w:sz="4" w:color="D5D5D5"/>
-              <w:right w:val="single" w:sz="4" w:color="D5D5D5"/>
-            </w:tcBorders>
-          </w:tcPr>
-          <w:p>
-            <w:pPr>
-              <w:spacing w:after="80" w:before="80"/>
-            </w:pPr>
-            <w:r>
-              <w:rPr>
-                <w:b w:val="0"/>
-                <w:sz w:val="18"/>
-              </w:rPr>
-              <w:t>Is this imported, floorplanned, placed, clocked, or routed?</w:t>
-            </w:r>
-          </w:p>
-        </w:tc>
-      </w:tr>
-      <w:tr>
-        <w:trPr>
-          <w:cantSplit/>
-        </w:trPr>
-        <w:tc>
-          <w:tcPr>
-            <w:tcW w:type="dxa" w:w="2952"/>
-            <w:tcMar>
-              <w:top w:w="75" w:type="dxa"/>
-              <w:left w:w="75" w:type="dxa"/>
-              <w:bottom w:w="75" w:type="dxa"/>
-              <w:right w:w="75" w:type="dxa"/>
-            </w:tcMar>
-            <w:tcBorders>
-              <w:top w:val="single" w:sz="4" w:color="D5D5D5"/>
-              <w:left w:val="single" w:sz="4" w:color="D5D5D5"/>
-              <w:bottom w:val="single" w:sz="4" w:color="D5D5D5"/>
-              <w:right w:val="single" w:sz="4" w:color="D5D5D5"/>
-            </w:tcBorders>
-          </w:tcPr>
-          <w:p>
-            <w:pPr>
-              <w:spacing w:after="80" w:before="80"/>
-            </w:pPr>
-            <w:r>
-              <w:rPr>
-                <w:b w:val="0"/>
-                <w:sz w:val="18"/>
-              </w:rPr>
-              <w:t>Area, timing, congestion, and violations</w:t>
-            </w:r>
-          </w:p>
-        </w:tc>
-        <w:tc>
-          <w:tcPr>
-            <w:tcW w:type="dxa" w:w="7128"/>
-            <w:tcMar>
-              <w:top w:w="75" w:type="dxa"/>
-              <w:left w:w="75" w:type="dxa"/>
-              <w:bottom w:w="75" w:type="dxa"/>
-              <w:right w:w="75" w:type="dxa"/>
-            </w:tcMar>
-            <w:tcBorders>
-              <w:top w:val="single" w:sz="4" w:color="D5D5D5"/>
-              <w:left w:val="single" w:sz="4" w:color="D5D5D5"/>
-              <w:bottom w:val="single" w:sz="4" w:color="D5D5D5"/>
-              <w:right w:val="single" w:sz="4" w:color="D5D5D5"/>
-            </w:tcBorders>
-          </w:tcPr>
-          <w:p>
-            <w:pPr>
-              <w:spacing w:after="80" w:before="80"/>
-            </w:pPr>
-            <w:r>
-              <w:rPr>
-                <w:b w:val="0"/>
-                <w:sz w:val="18"/>
-              </w:rPr>
-              <w:t>What passes, what fails, and what remains unmeasured?</w:t>
-            </w:r>
-          </w:p>
-        </w:tc>
-      </w:tr>
-    </w:tbl>
-    <w:p>
-      <w:pPr>
-        <w:spacing w:after="0"/>
-      </w:pPr>
-    </w:p>
-    <w:p>
-      <w:pPr/>
-      <w:r>
-        <w:t>The immediate project work is a runnable chip-level flow plus separate unit runs with clearly marked stubs where necessary. Keep the flow reproducible as real blocks arrive. Do not present stub area as an estimate of the missing block or an empty timing report as closure.</w:t>
       </w:r>
     </w:p>
     <w:p>

</xml_diff>